<commit_message>
Added add & manage people features
</commit_message>
<xml_diff>
--- a/mp.docx
+++ b/mp.docx
@@ -12212,13 +12212,6 @@
         <w:lastRenderedPageBreak/>
         <w:t>(6) Populate Tables</w:t>
       </w:r>
-    </w:p>
-    <w:p>
-      <w:pPr>
-        <w:rPr>
-          <w:lang w:val="en-US"/>
-        </w:rPr>
-      </w:pPr>
     </w:p>
     <w:p>
       <w:pPr>
@@ -13128,6 +13121,42 @@
           <w:lang w:val="en-US"/>
         </w:rPr>
         <w:t>View &amp; update help requests</w:t>
+      </w:r>
+    </w:p>
+    <w:p>
+      <w:pPr>
+        <w:pStyle w:val="ListParagraph"/>
+        <w:numPr>
+          <w:ilvl w:val="0"/>
+          <w:numId w:val="3"/>
+        </w:numPr>
+        <w:rPr>
+          <w:lang w:val="en-US"/>
+        </w:rPr>
+      </w:pPr>
+      <w:r>
+        <w:rPr>
+          <w:lang w:val="en-US"/>
+        </w:rPr>
+        <w:t>Add a new person</w:t>
+      </w:r>
+    </w:p>
+    <w:p>
+      <w:pPr>
+        <w:pStyle w:val="ListParagraph"/>
+        <w:numPr>
+          <w:ilvl w:val="0"/>
+          <w:numId w:val="3"/>
+        </w:numPr>
+        <w:rPr>
+          <w:lang w:val="en-US"/>
+        </w:rPr>
+      </w:pPr>
+      <w:r>
+        <w:rPr>
+          <w:lang w:val="en-US"/>
+        </w:rPr>
+        <w:t>Manage people</w:t>
       </w:r>
     </w:p>
     <w:p>

</xml_diff>